<commit_message>
Preserve local marketing restructure + docs (WIP, not deployed)
The unified single-server restructure of the marketing site that has been
local-only until now:
- new root index.html (live-only home; waitlist mode removed) and sign-in/
- vercel.json: removed the / -> /join-waitlist redirect (root is now the home)
- .gitignore: ignore .scratch/
- project docs: CONTEXT.md, docs/ (ADRs + specs)
- updated pilot .docx files

Committed to the v2-wip branch, NOT main, so nothing deploys: the live
production marketing site stays exactly as it is. Merge v2-wip -> main when
this restructure is ready to go live.

Co-Authored-By: Claude Opus 4.8 <noreply@anthropic.com>
Claude-Session: https://claude.ai/code/session_01U29qjsyvwoXmFaQAQmDqHK
</commit_message>
<xml_diff>
--- a/Pouncity Pilot - Feature Spec.docx
+++ b/Pouncity Pilot - Feature Spec.docx
@@ -71,7 +71,7 @@
         <w:rPr>
           <w:i w:val="0"/>
         </w:rPr>
-        <w:t>A single "passport" record per pet that any caregiver can be handed instantly, with zero setup at the moment of need. The owner creates the passport once; an AI-generated diet plan and grooming guide sit on top of it, personalized from basic pet details; a lightweight daily tap keeps the passport current; and a standing, pre-scoped share link means handover is already done before the owner ever needs it — no last-minute setup, no signup required to view.</w:t>
+        <w:t>A single "diary" record per pet that any caregiver can be handed instantly, with zero setup at the moment of need. The owner creates the diary once; an AI-generated diet plan and grooming guide sit on top of it, personalized from basic pet details; a lightweight daily tap keeps the diary current; and a standing, pre-scoped share link means handover is already done before the owner ever needs it — no last-minute setup, no signup required to view.</w:t>
       </w:r>
     </w:p>
     <w:p>
@@ -87,7 +87,7 @@
         <w:pStyle w:val="ListNumber"/>
       </w:pPr>
       <w:r>
-        <w:t>As a pet owner, I want to create a passport for my pet with just its name, species, breed, age, and weight, so that I can get started without a long form standing between me and using the app.</w:t>
+        <w:t>As a pet owner, I want to create a diary for my pet with just its name, species, breed, age, and weight, so that I can get started without a long form standing between me and using the app.</w:t>
       </w:r>
     </w:p>
     <w:p>
@@ -95,7 +95,7 @@
         <w:pStyle w:val="ListNumber"/>
       </w:pPr>
       <w:r>
-        <w:t>As a pet owner, I want to add a photo of my pet to the passport, so that it feels like a real record of my pet, not a generic template.</w:t>
+        <w:t>As a pet owner, I want to add a photo of my pet to the diary, so that it feels like a real record of my pet, not a generic template.</w:t>
       </w:r>
     </w:p>
     <w:p>
@@ -103,7 +103,7 @@
         <w:pStyle w:val="ListNumber"/>
       </w:pPr>
       <w:r>
-        <w:t>As a pet owner, I want to be gently nudged to complete the rest of the passport (quirks, vet contact, diet, grooming) after initial setup, so that I fill it out over time without it blocking me upfront.</w:t>
+        <w:t>As a pet owner, I want to be gently nudged to complete the rest of the diary (quirks, vet contact, diet, grooming) after initial setup, so that I fill it out over time without it blocking me upfront.</w:t>
       </w:r>
     </w:p>
     <w:p>
@@ -119,7 +119,7 @@
         <w:pStyle w:val="ListNumber"/>
       </w:pPr>
       <w:r>
-        <w:t>As a pet owner, I want to store my vet's name and phone number on the passport, so that a sitter has emergency contact info without me having to relay it separately.</w:t>
+        <w:t>As a pet owner, I want to store my vet's name and phone number on the diary, so that a sitter has emergency contact info without me having to relay it separately.</w:t>
       </w:r>
     </w:p>
     <w:p>
@@ -191,7 +191,7 @@
         <w:pStyle w:val="ListNumber"/>
       </w:pPr>
       <w:r>
-        <w:t>As a pet owner, I want to generate a shareable link for my pet's passport once, so that I don't have to set anything up again when I actually need to hand my pet off.</w:t>
+        <w:t>As a pet owner, I want to generate a shareable link for my pet's diary once, so that I don't have to set anything up again when I actually need to hand my pet off.</w:t>
       </w:r>
     </w:p>
     <w:p>
@@ -207,7 +207,7 @@
         <w:pStyle w:val="ListNumber"/>
       </w:pPr>
       <w:r>
-        <w:t>As a caregiver receiving a passport link, I want to view the full passport immediately without creating an account, so that I can get the information I need (feeding, routine, quirks, vet contact) as fast as possible.</w:t>
+        <w:t>As a caregiver receiving a diary link, I want to view the full diary immediately without creating an account, so that I can get the information I need (feeding, routine, quirks, vet contact) as fast as possible.</w:t>
       </w:r>
     </w:p>
     <w:p>
@@ -223,7 +223,7 @@
         <w:pStyle w:val="ListNumber"/>
       </w:pPr>
       <w:r>
-        <w:t>As a pet owner, I want to manually revoke a caregiver's access to the passport link at any time, so that access ends the moment I decide it should, per my own judgment of "done."</w:t>
+        <w:t>As a pet owner, I want to manually revoke a caregiver's access to the diary link at any time, so that access ends the moment I decide it should, per my own judgment of "done."</w:t>
       </w:r>
     </w:p>
     <w:p>
@@ -231,7 +231,7 @@
         <w:pStyle w:val="ListNumber"/>
       </w:pPr>
       <w:r>
-        <w:t>As a pet owner, I want to see who currently has access to my pet's passport, so that I know exactly who can view it before I decide to revoke anything.</w:t>
+        <w:t>As a pet owner, I want to see who currently has access to my pet's diary, so that I know exactly who can view it before I decide to revoke anything.</w:t>
       </w:r>
     </w:p>
     <w:p>
@@ -255,7 +255,7 @@
         <w:pStyle w:val="ListNumber"/>
       </w:pPr>
       <w:r>
-        <w:t>As a returning pet owner, I want to log back in without re-entering my pet's information, so that my passport persists across sessions.</w:t>
+        <w:t>As a returning pet owner, I want to log back in without re-entering my pet's information, so that my diary persists across sessions.</w:t>
       </w:r>
     </w:p>
     <w:p>
@@ -319,7 +319,7 @@
         <w:pStyle w:val="ListNumber"/>
       </w:pPr>
       <w:r>
-        <w:t>As a pet owner, I want my pet's passport to persist and remain accurate as the single source of truth, so that every caregiver who views it sees the same, current information.</w:t>
+        <w:t>As a pet owner, I want my pet's diary to persist and remain accurate as the single source of truth, so that every caregiver who views it sees the same, current information.</w:t>
       </w:r>
     </w:p>
     <w:p>
@@ -343,7 +343,7 @@
         <w:pStyle w:val="ListBullet"/>
       </w:pPr>
       <w:r>
-        <w:t>Passport entity: required fields at creation — name, species, breed, age/birthdate, weight, photo. Optional fields, filled in post-onboarding — quirks (free text), vet contact (name/phone/clinic), diet plan, diet tracking log, grooming guide, grooming log.</w:t>
+        <w:t>Diary entity: required fields at creation — name, species, breed, age/birthdate, weight, photo. Optional fields, filled in post-onboarding — quirks (free text), vet contact (name/phone/clinic), diet plan, diet tracking log, grooming guide, grooming log.</w:t>
       </w:r>
     </w:p>
     <w:p>
@@ -351,7 +351,7 @@
         <w:pStyle w:val="ListBullet"/>
       </w:pPr>
       <w:r>
-        <w:t>Onboarding flow: account creation → create passport (required fields only) → land in app with a visible "complete your passport" progress nudge covering the optional fields.</w:t>
+        <w:t>Onboarding flow: account creation → create diary (required fields only) → land in app with a visible "complete your diary" progress nudge covering the optional fields.</w:t>
       </w:r>
     </w:p>
     <w:p>
@@ -367,7 +367,7 @@
         <w:pStyle w:val="ListBullet"/>
       </w:pPr>
       <w:r>
-        <w:t>Caregiver model: single flat role — no tiered permissions. Anyone with passport access sees everything on the passport (no field-level redaction in v1).</w:t>
+        <w:t>Caregiver model: single flat role — no tiered permissions. Anyone with diary access sees everything on the diary (no field-level redaction in v1).</w:t>
       </w:r>
     </w:p>
     <w:p>
@@ -375,7 +375,7 @@
         <w:pStyle w:val="ListBullet"/>
       </w:pPr>
       <w:r>
-        <w:t>Handover link: owner-generated shareable link/code per passport, standing (non-expiring) until manually revoked. Opening the link grants immediate read access to the full passport with no account required. Interacting (logging tracking, receiving reminders) requires the recipient to create an account and be associated with that passport.</w:t>
+        <w:t>Handover link: owner-generated shareable link/code per diary, standing (non-expiring) until manually revoked. Opening the link grants immediate read access to the full diary with no account required. Interacting (logging tracking, receiving reminders) requires the recipient to create an account and be associated with that diary.</w:t>
       </w:r>
     </w:p>
     <w:p>
@@ -383,7 +383,7 @@
         <w:pStyle w:val="ListBullet"/>
       </w:pPr>
       <w:r>
-        <w:t>Revocation: owner-controlled, manual, from a visible list of current passport access grants (no auto-expiry in v1).</w:t>
+        <w:t>Revocation: owner-controlled, manual, from a visible list of current diary access grants (no auto-expiry in v1).</w:t>
       </w:r>
     </w:p>
     <w:p>
@@ -399,7 +399,7 @@
         <w:pStyle w:val="ListBullet"/>
       </w:pPr>
       <w:r>
-        <w:t>Diet tracking: binary daily confirm ("fed today") per passport, with an optional free-text deviation note. No structured quantity logging.</w:t>
+        <w:t>Diet tracking: binary daily confirm ("fed today") per diary, with an optional free-text deviation note. No structured quantity logging.</w:t>
       </w:r>
     </w:p>
     <w:p>
@@ -455,7 +455,7 @@
         <w:rPr>
           <w:i w:val="0"/>
         </w:rPr>
-        <w:t>There is no existing codebase or prior art to build on — this is a pre-build spec. Recommended seam: test through a single service/API layer that owns passport CRUD, handover link lifecycle, diet/grooming generation requests, and tracking confirms — rather than through the UI — so the pilot's behavioral beliefs can be validated independently of frontend churn.</w:t>
+        <w:t>There is no existing codebase or prior art to build on — this is a pre-build spec. Recommended seam: test through a single service/API layer that owns diary CRUD, handover link lifecycle, diet/grooming generation requests, and tracking confirms — rather than through the UI — so the pilot's behavioral beliefs can be validated independently of frontend churn.</w:t>
       </w:r>
     </w:p>
     <w:p>
@@ -463,7 +463,7 @@
         <w:pStyle w:val="ListBullet"/>
       </w:pPr>
       <w:r>
-        <w:t>Tests should verify external behavior, not implementation: e.g. "a revoked link returns no passport data" rather than "the revoke function sets a flag."</w:t>
+        <w:t>Tests should verify external behavior, not implementation: e.g. "a revoked link returns no diary data" rather than "the revoke function sets a flag."</w:t>
       </w:r>
     </w:p>
     <w:p>
@@ -471,7 +471,7 @@
         <w:pStyle w:val="ListBullet"/>
       </w:pPr>
       <w:r>
-        <w:t>Passport module: creation with required-only fields succeeds; optional fields can be added independently after creation; a passport always has exactly one owner account.</w:t>
+        <w:t>Diary module: creation with required-only fields succeeds; optional fields can be added independently after creation; a diary always has exactly one owner account.</w:t>
       </w:r>
     </w:p>
     <w:p>
@@ -479,7 +479,7 @@
         <w:pStyle w:val="ListBullet"/>
       </w:pPr>
       <w:r>
-        <w:t>Handover module: link generation produces a working, unauthenticated read view of the full passport; revocation immediately invalidates that access; interacting (tracking/reminders) as a recipient requires account creation tied to that passport.</w:t>
+        <w:t>Handover module: link generation produces a working, unauthenticated read view of the full diary; revocation immediately invalidates that access; interacting (tracking/reminders) as a recipient requires account creation tied to that diary.</w:t>
       </w:r>
     </w:p>
     <w:p>
@@ -519,7 +519,7 @@
         <w:pStyle w:val="ListBullet"/>
       </w:pPr>
       <w:r>
-        <w:t>Multi-pet households (one passport per household).</w:t>
+        <w:t>Multi-pet households (one diary per household).</w:t>
       </w:r>
     </w:p>
     <w:p>

</xml_diff>